<commit_message>
Types of data distribution and importance of normal distribution
</commit_message>
<xml_diff>
--- a/machine_learning_basics/data-preprocessing(feature scaling).docx
+++ b/machine_learning_basics/data-preprocessing(feature scaling).docx
@@ -32,14 +32,12 @@
           <w:lang w:val="en-US"/>
         </w:rPr>
       </w:pPr>
-      <w:proofErr w:type="spellStart"/>
       <w:r>
         <w:rPr>
           <w:lang w:val="en-US"/>
         </w:rPr>
         <w:t>Dropna</w:t>
       </w:r>
-      <w:proofErr w:type="spellEnd"/>
     </w:p>
     <w:p>
       <w:pPr>
@@ -52,19 +50,11 @@
           <w:lang w:val="en-US"/>
         </w:rPr>
       </w:pPr>
-      <w:proofErr w:type="spellStart"/>
-      <w:r>
-        <w:rPr>
-          <w:lang w:val="en-US"/>
-        </w:rPr>
-        <w:t>Fillna</w:t>
-      </w:r>
-      <w:proofErr w:type="spellEnd"/>
-      <w:r>
-        <w:rPr>
-          <w:lang w:val="en-US"/>
-        </w:rPr>
-        <w:t xml:space="preserve"> – filling mean on nan field</w:t>
+      <w:r>
+        <w:rPr>
+          <w:lang w:val="en-US"/>
+        </w:rPr>
+        <w:t>Fillna – filling mean on nan field</w:t>
       </w:r>
     </w:p>
     <w:p>
@@ -108,6 +98,19 @@
       </w:r>
     </w:p>
     <w:p>
+      <w:r>
+        <w:t xml:space="preserve">And </w:t>
+      </w:r>
+      <w:proofErr w:type="gramStart"/>
+      <w:r>
+        <w:t>also</w:t>
+      </w:r>
+      <w:proofErr w:type="gramEnd"/>
+      <w:r>
+        <w:t xml:space="preserve"> a machine learning model’s may not be efficient when we give a data which has the numeric values which as 5-8 digits</w:t>
+      </w:r>
+    </w:p>
+    <w:p>
       <w:pPr>
         <w:rPr>
           <w:b/>
@@ -134,6 +137,7 @@
         <w:rPr>
           <w:b/>
           <w:bCs/>
+          <w:noProof/>
           <w:lang w:val="en-US"/>
         </w:rPr>
         <w:drawing>
@@ -202,6 +206,7 @@
         <w:rPr>
           <w:b/>
           <w:bCs/>
+          <w:noProof/>
           <w:lang w:val="en-US"/>
         </w:rPr>
         <w:drawing>
@@ -319,6 +324,7 @@
         <w:rPr>
           <w:b/>
           <w:bCs/>
+          <w:noProof/>
           <w:lang w:val="en-US"/>
         </w:rPr>
         <w:lastRenderedPageBreak/>
@@ -347,6 +353,66 @@
                     <a:xfrm>
                       <a:off x="0" y="0"/>
                       <a:ext cx="5585944" cy="2933954"/>
+                    </a:xfrm>
+                    <a:prstGeom prst="rect">
+                      <a:avLst/>
+                    </a:prstGeom>
+                  </pic:spPr>
+                </pic:pic>
+              </a:graphicData>
+            </a:graphic>
+          </wp:inline>
+        </w:drawing>
+      </w:r>
+    </w:p>
+    <w:p>
+      <w:pPr>
+        <w:rPr>
+          <w:lang w:val="en-US"/>
+        </w:rPr>
+      </w:pPr>
+      <w:r>
+        <w:rPr>
+          <w:lang w:val="en-US"/>
+        </w:rPr>
+        <w:t>All the below kind of distributed data should be normalized to normal distribution, for this standard scaler function on sklearn will be used here.</w:t>
+      </w:r>
+    </w:p>
+    <w:p>
+      <w:pPr>
+        <w:rPr>
+          <w:lang w:val="en-US"/>
+        </w:rPr>
+      </w:pPr>
+      <w:r>
+        <w:rPr>
+          <w:lang w:val="en-US"/>
+        </w:rPr>
+        <w:drawing>
+          <wp:inline distT="0" distB="0" distL="0" distR="0" wp14:anchorId="0906D55E" wp14:editId="66342873">
+            <wp:extent cx="4275190" cy="2949196"/>
+            <wp:effectExtent l="0" t="0" r="0" b="3810"/>
+            <wp:docPr id="359605117" name="Picture 1"/>
+            <wp:cNvGraphicFramePr>
+              <a:graphicFrameLocks xmlns:a="http://schemas.openxmlformats.org/drawingml/2006/main" noChangeAspect="1"/>
+            </wp:cNvGraphicFramePr>
+            <a:graphic xmlns:a="http://schemas.openxmlformats.org/drawingml/2006/main">
+              <a:graphicData uri="http://schemas.openxmlformats.org/drawingml/2006/picture">
+                <pic:pic xmlns:pic="http://schemas.openxmlformats.org/drawingml/2006/picture">
+                  <pic:nvPicPr>
+                    <pic:cNvPr id="359605117" name=""/>
+                    <pic:cNvPicPr/>
+                  </pic:nvPicPr>
+                  <pic:blipFill>
+                    <a:blip r:embed="rId8"/>
+                    <a:stretch>
+                      <a:fillRect/>
+                    </a:stretch>
+                  </pic:blipFill>
+                  <pic:spPr>
+                    <a:xfrm>
+                      <a:off x="0" y="0"/>
+                      <a:ext cx="4275190" cy="2949196"/>
                     </a:xfrm>
                     <a:prstGeom prst="rect">
                       <a:avLst/>
@@ -1069,6 +1135,7 @@
   <w:style w:type="character" w:default="1" w:styleId="DefaultParagraphFont">
     <w:name w:val="Default Paragraph Font"/>
     <w:uiPriority w:val="1"/>
+    <w:semiHidden/>
     <w:unhideWhenUsed/>
   </w:style>
   <w:style w:type="table" w:default="1" w:styleId="TableNormal">

</xml_diff>